<commit_message>
Proposta Surcin: assinatura Renato Romão, R2 Tech Consultoria
Co-Authored-By: Claude Opus 5.5 (1M context) <noreply@anthropic.com>
Claude-Session: https://claude.ai/code/session_0127xFh2xB8HoQ18BDMAY2QJ
</commit_message>
<xml_diff>
--- a/proposta-surcin/05-roteiro-apresentacao-e-decisoes.docx
+++ b/proposta-surcin/05-roteiro-apresentacao-e-decisoes.docx
@@ -508,7 +508,7 @@
                 <w:b w:val="0"/>
                 <w:sz w:val="20"/>
               </w:rPr>
-              <w:t>Marca e contato</w:t>
+              <w:t>Contato na proposta</w:t>
             </w:r>
           </w:p>
         </w:tc>
@@ -523,7 +523,7 @@
                 <w:b w:val="0"/>
                 <w:sz w:val="20"/>
               </w:rPr>
-              <w:t>"R2 Tech Consulting"; confirmar sobrenome, e-mail e telefone</w:t>
+              <w:t>Renato Romão, R2 Tech Consultoria; e-mail r2techconsultoria@gmail.com (do convite da reunião, confirmar); falta o telefone</w:t>
             </w:r>
           </w:p>
         </w:tc>

</xml_diff>